<commit_message>
revert: remove test content
</commit_message>
<xml_diff>
--- a/New Microsoft Word 文档 (2).docx
+++ b/New Microsoft Word 文档 (2).docx
@@ -6765,19 +6765,6 @@
       </w:r>
     </w:p>
     <w:p>
-      <w:pPr>
-        <w:rPr>
-          <w:rFonts w:hint="default"/>
-          <w:lang w:val="en-US"/>
-        </w:rPr>
-      </w:pPr>
-      <w:r>
-        <w:rPr>
-          <w:rFonts w:hint="default"/>
-          <w:lang w:val="en-US"/>
-        </w:rPr>
-        <w:t>1111111111111111111111111111111</w:t>
-      </w:r>
       <w:bookmarkStart w:id="0" w:name="_GoBack"/>
       <w:bookmarkEnd w:id="0"/>
     </w:p>
@@ -6892,7 +6879,7 @@
     <w:lsdException w:qFormat="1" w:unhideWhenUsed="0" w:uiPriority="0" w:semiHidden="0" w:name="Title"/>
     <w:lsdException w:unhideWhenUsed="0" w:uiPriority="0" w:semiHidden="0" w:name="Closing"/>
     <w:lsdException w:unhideWhenUsed="0" w:uiPriority="0" w:semiHidden="0" w:name="Signature"/>
-    <w:lsdException w:qFormat="1" w:unhideWhenUsed="0" w:uiPriority="0" w:name="Default Paragraph Font"/>
+    <w:lsdException w:unhideWhenUsed="0" w:uiPriority="0" w:name="Default Paragraph Font"/>
     <w:lsdException w:unhideWhenUsed="0" w:uiPriority="0" w:semiHidden="0" w:name="Body Text"/>
     <w:lsdException w:unhideWhenUsed="0" w:uiPriority="0" w:semiHidden="0" w:name="Body Text Indent"/>
     <w:lsdException w:unhideWhenUsed="0" w:uiPriority="0" w:semiHidden="0" w:name="List Continue"/>
@@ -7095,7 +7082,6 @@
   <w:style w:type="character" w:default="1" w:styleId="3">
     <w:name w:val="Default Paragraph Font"/>
     <w:semiHidden/>
-    <w:qFormat/>
     <w:uiPriority w:val="0"/>
   </w:style>
   <w:style w:type="table" w:default="1" w:styleId="2">

</xml_diff>